<commit_message>
chore: criação de arquivos
- Criado: aula05 MAUI
</commit_message>
<xml_diff>
--- a/semestre_3/Tecnologia_da_Informacao_3/Atividades/Atividade05/relatorio_lgpd_seguranca.docx
+++ b/semestre_3/Tecnologia_da_Informacao_3/Atividades/Atividade05/relatorio_lgpd_seguranca.docx
@@ -1,6 +1,6 @@
 
 <file path=word/document.xml><?xml version="1.0" encoding="utf-8"?>
-<w:document xmlns:wpc="http://schemas.microsoft.com/office/word/2010/wordprocessingCanvas" xmlns:cx="http://schemas.microsoft.com/office/drawing/2014/chartex" xmlns:cx1="http://schemas.microsoft.com/office/drawing/2015/9/8/chartex" xmlns:cx2="http://schemas.microsoft.com/office/drawing/2015/10/21/chartex" xmlns:cx3="http://schemas.microsoft.com/office/drawing/2016/5/9/chartex" xmlns:cx4="http://schemas.microsoft.com/office/drawing/2016/5/10/chartex" xmlns:cx5="http://schemas.microsoft.com/office/drawing/2016/5/11/chartex" xmlns:cx6="http://schemas.microsoft.com/office/drawing/2016/5/12/chartex" xmlns:cx7="http://schemas.microsoft.com/office/drawing/2016/5/13/chartex" xmlns:cx8="http://schemas.microsoft.com/office/drawing/2016/5/14/chartex" xmlns:mc="http://schemas.openxmlformats.org/markup-compatibility/2006" xmlns:aink="http://schemas.microsoft.com/office/drawing/2016/ink" xmlns:am3d="http://schemas.microsoft.com/office/drawing/2017/model3d" xmlns:o="urn:schemas-microsoft-com:office:office" xmlns:oel="http://schemas.microsoft.com/office/2019/extlst" xmlns:r="http://schemas.openxmlformats.org/officeDocument/2006/relationships" xmlns:m="http://schemas.openxmlformats.org/officeDocument/2006/math" xmlns:v="urn:schemas-microsoft-com:vml" xmlns:wp14="http://schemas.microsoft.com/office/word/2010/wordprocessingDrawing" xmlns:wp="http://schemas.openxmlformats.org/drawingml/2006/wordprocessingDrawing" xmlns:w10="urn:schemas-microsoft-com:office:word" xmlns:w="http://schemas.openxmlformats.org/wordprocessingml/2006/main" xmlns:w14="http://schemas.microsoft.com/office/word/2010/wordml" xmlns:w15="http://schemas.microsoft.com/office/word/2012/wordml" xmlns:w16cex="http://schemas.microsoft.com/office/word/2018/wordml/cex" xmlns:w16cid="http://schemas.microsoft.com/office/word/2016/wordml/cid" xmlns:w16="http://schemas.microsoft.com/office/word/2018/wordml" xmlns:w16du="http://schemas.microsoft.com/office/word/2023/wordml/word16du" xmlns:w16sdtdh="http://schemas.microsoft.com/office/word/2020/wordml/sdtdatahash" xmlns:w16sdtfl="http://schemas.microsoft.com/office/word/2024/wordml/sdtformatlock" xmlns:w16se="http://schemas.microsoft.com/office/word/2015/wordml/symex" xmlns:wpg="http://schemas.microsoft.com/office/word/2010/wordprocessingGroup" xmlns:wpi="http://schemas.microsoft.com/office/word/2010/wordprocessingInk" xmlns:wne="http://schemas.microsoft.com/office/word/2006/wordml" xmlns:wps="http://schemas.microsoft.com/office/word/2010/wordprocessingShape" mc:Ignorable="w14 w15 w16se w16cid w16 w16cex w16sdtdh w16sdtfl w16du wp14">
+<w:document xmlns:wpc="http://schemas.microsoft.com/office/word/2010/wordprocessingCanvas" xmlns:cx="http://schemas.microsoft.com/office/drawing/2014/chartex" xmlns:cx1="http://schemas.microsoft.com/office/drawing/2015/9/8/chartex" xmlns:cx2="http://schemas.microsoft.com/office/drawing/2015/10/21/chartex" xmlns:cx3="http://schemas.microsoft.com/office/drawing/2016/5/9/chartex" xmlns:cx4="http://schemas.microsoft.com/office/drawing/2016/5/10/chartex" xmlns:cx5="http://schemas.microsoft.com/office/drawing/2016/5/11/chartex" xmlns:cx6="http://schemas.microsoft.com/office/drawing/2016/5/12/chartex" xmlns:cx7="http://schemas.microsoft.com/office/drawing/2016/5/13/chartex" xmlns:cx8="http://schemas.microsoft.com/office/drawing/2016/5/14/chartex" xmlns:mc="http://schemas.openxmlformats.org/markup-compatibility/2006" xmlns:aink="http://schemas.microsoft.com/office/drawing/2016/ink" xmlns:am3d="http://schemas.microsoft.com/office/drawing/2017/model3d" xmlns:o="urn:schemas-microsoft-com:office:office" xmlns:r="http://schemas.openxmlformats.org/officeDocument/2006/relationships" xmlns:m="http://schemas.openxmlformats.org/officeDocument/2006/math" xmlns:v="urn:schemas-microsoft-com:vml" xmlns:wp14="http://schemas.microsoft.com/office/word/2010/wordprocessingDrawing" xmlns:wp="http://schemas.openxmlformats.org/drawingml/2006/wordprocessingDrawing" xmlns:w10="urn:schemas-microsoft-com:office:word" xmlns:w="http://schemas.openxmlformats.org/wordprocessingml/2006/main" xmlns:w14="http://schemas.microsoft.com/office/word/2010/wordml" xmlns:w15="http://schemas.microsoft.com/office/word/2012/wordml" xmlns:w16cex="http://schemas.microsoft.com/office/word/2018/wordml/cex" xmlns:w16cid="http://schemas.microsoft.com/office/word/2016/wordml/cid" xmlns:w16="http://schemas.microsoft.com/office/word/2018/wordml" xmlns:w16sdtdh="http://schemas.microsoft.com/office/word/2020/wordml/sdtdatahash" xmlns:w16se="http://schemas.microsoft.com/office/word/2015/wordml/symex" xmlns:wpg="http://schemas.microsoft.com/office/word/2010/wordprocessingGroup" xmlns:wpi="http://schemas.microsoft.com/office/word/2010/wordprocessingInk" xmlns:wne="http://schemas.microsoft.com/office/word/2006/wordml" xmlns:wps="http://schemas.microsoft.com/office/word/2010/wordprocessingShape" mc:Ignorable="w14 w15 w16se w16cid w16 w16cex w16sdtdh wp14">
   <w:body>
     <w:p>
       <w:pPr>
@@ -49,6 +49,15 @@
         </w:rPr>
         <w:t>:</w:t>
       </w:r>
+      <w:r>
+        <w:rPr>
+          <w:rFonts w:asciiTheme="majorHAnsi" w:hAnsiTheme="majorHAnsi" w:cstheme="majorHAnsi"/>
+          <w:sz w:val="24"/>
+          <w:szCs w:val="24"/>
+          <w:lang w:val="pt-BR"/>
+        </w:rPr>
+        <w:t xml:space="preserve"> Matheus Luiz Massuda</w:t>
+      </w:r>
     </w:p>
     <w:p>
       <w:pPr>
@@ -68,6 +77,15 @@
         </w:rPr>
         <w:t>Turma:</w:t>
       </w:r>
+      <w:r>
+        <w:rPr>
+          <w:rFonts w:asciiTheme="majorHAnsi" w:hAnsiTheme="majorHAnsi" w:cstheme="majorHAnsi"/>
+          <w:sz w:val="24"/>
+          <w:szCs w:val="24"/>
+          <w:lang w:val="pt-BR"/>
+        </w:rPr>
+        <w:t xml:space="preserve"> FEJ</w:t>
+      </w:r>
     </w:p>
     <w:p>
       <w:pPr>
@@ -85,7 +103,52 @@
           <w:szCs w:val="24"/>
           <w:lang w:val="pt-BR"/>
         </w:rPr>
-        <w:t>Data: ____/____/_______</w:t>
+        <w:t xml:space="preserve">Data: </w:t>
+      </w:r>
+      <w:r>
+        <w:rPr>
+          <w:rFonts w:asciiTheme="majorHAnsi" w:hAnsiTheme="majorHAnsi" w:cstheme="majorHAnsi"/>
+          <w:sz w:val="24"/>
+          <w:szCs w:val="24"/>
+          <w:lang w:val="pt-BR"/>
+        </w:rPr>
+        <w:t>21</w:t>
+      </w:r>
+      <w:r>
+        <w:rPr>
+          <w:rFonts w:asciiTheme="majorHAnsi" w:hAnsiTheme="majorHAnsi" w:cstheme="majorHAnsi"/>
+          <w:sz w:val="24"/>
+          <w:szCs w:val="24"/>
+          <w:lang w:val="pt-BR"/>
+        </w:rPr>
+        <w:t>/</w:t>
+      </w:r>
+      <w:r>
+        <w:rPr>
+          <w:rFonts w:asciiTheme="majorHAnsi" w:hAnsiTheme="majorHAnsi" w:cstheme="majorHAnsi"/>
+          <w:sz w:val="24"/>
+          <w:szCs w:val="24"/>
+          <w:lang w:val="pt-BR"/>
+        </w:rPr>
+        <w:t>03</w:t>
+      </w:r>
+      <w:r>
+        <w:rPr>
+          <w:rFonts w:asciiTheme="majorHAnsi" w:hAnsiTheme="majorHAnsi" w:cstheme="majorHAnsi"/>
+          <w:sz w:val="24"/>
+          <w:szCs w:val="24"/>
+          <w:lang w:val="pt-BR"/>
+        </w:rPr>
+        <w:t>/</w:t>
+      </w:r>
+      <w:r>
+        <w:rPr>
+          <w:rFonts w:asciiTheme="majorHAnsi" w:hAnsiTheme="majorHAnsi" w:cstheme="majorHAnsi"/>
+          <w:sz w:val="24"/>
+          <w:szCs w:val="24"/>
+          <w:lang w:val="pt-BR"/>
+        </w:rPr>
+        <w:t>2026</w:t>
       </w:r>
     </w:p>
     <w:p>
@@ -126,7 +189,14 @@
           <w:rFonts w:asciiTheme="majorHAnsi" w:hAnsiTheme="majorHAnsi" w:cstheme="majorHAnsi"/>
           <w:lang w:val="pt-BR"/>
         </w:rPr>
-        <w:t>Empresa/Organização: ___________________________</w:t>
+        <w:t xml:space="preserve">Empresa/Organização: </w:t>
+      </w:r>
+      <w:r>
+        <w:rPr>
+          <w:rFonts w:asciiTheme="majorHAnsi" w:hAnsiTheme="majorHAnsi" w:cstheme="majorHAnsi"/>
+          <w:lang w:val="pt-BR"/>
+        </w:rPr>
+        <w:t>Facebook</w:t>
       </w:r>
     </w:p>
     <w:p>
@@ -141,7 +211,14 @@
           <w:rFonts w:asciiTheme="majorHAnsi" w:hAnsiTheme="majorHAnsi" w:cstheme="majorHAnsi"/>
           <w:lang w:val="pt-BR"/>
         </w:rPr>
-        <w:t>Ano do incidente: ___________________________</w:t>
+        <w:t xml:space="preserve">Ano do incidente: </w:t>
+      </w:r>
+      <w:r>
+        <w:rPr>
+          <w:rFonts w:asciiTheme="majorHAnsi" w:hAnsiTheme="majorHAnsi" w:cstheme="majorHAnsi"/>
+          <w:lang w:val="pt-BR"/>
+        </w:rPr>
+        <w:t>Revelação pública em 2018</w:t>
       </w:r>
     </w:p>
     <w:p>
@@ -184,7 +261,65 @@
           <w:rFonts w:asciiTheme="majorHAnsi" w:hAnsiTheme="majorHAnsi" w:cstheme="majorHAnsi"/>
           <w:lang w:val="pt-BR"/>
         </w:rPr>
-        <w:t xml:space="preserve"> (site, artigo, IA): ___________________________</w:t>
+        <w:t xml:space="preserve"> (site, artigo, IA): </w:t>
+      </w:r>
+      <w:r>
+        <w:rPr>
+          <w:rFonts w:asciiTheme="majorHAnsi" w:hAnsiTheme="majorHAnsi" w:cstheme="majorHAnsi"/>
+          <w:lang w:val="pt-BR"/>
+        </w:rPr>
+        <w:t xml:space="preserve">Reportagens sobre o caso </w:t>
+      </w:r>
+      <w:proofErr w:type="spellStart"/>
+      <w:r>
+        <w:t>Escândalo</w:t>
+      </w:r>
+      <w:proofErr w:type="spellEnd"/>
+      <w:r>
+        <w:t xml:space="preserve"> Cambridge Analytica</w:t>
+      </w:r>
+      <w:r>
+        <w:t xml:space="preserve">, </w:t>
+      </w:r>
+      <w:proofErr w:type="spellStart"/>
+      <w:r>
+        <w:t>portais</w:t>
+      </w:r>
+      <w:proofErr w:type="spellEnd"/>
+      <w:r>
+        <w:t xml:space="preserve"> G1, </w:t>
+      </w:r>
+      <w:proofErr w:type="spellStart"/>
+      <w:r>
+        <w:t>relatórios</w:t>
+      </w:r>
+      <w:proofErr w:type="spellEnd"/>
+      <w:r>
+        <w:t xml:space="preserve"> e </w:t>
+      </w:r>
+      <w:proofErr w:type="spellStart"/>
+      <w:r>
+        <w:t>vídeos</w:t>
+      </w:r>
+      <w:proofErr w:type="spellEnd"/>
+      <w:r>
+        <w:t xml:space="preserve"> </w:t>
+      </w:r>
+      <w:proofErr w:type="spellStart"/>
+      <w:r>
+        <w:t>acrvo</w:t>
+      </w:r>
+      <w:proofErr w:type="spellEnd"/>
+      <w:r>
+        <w:t xml:space="preserve"> </w:t>
+      </w:r>
+      <w:proofErr w:type="spellStart"/>
+      <w:r>
+        <w:t>Youtube</w:t>
+      </w:r>
+      <w:proofErr w:type="spellEnd"/>
+      <w:r>
+        <w:t>.</w:t>
       </w:r>
     </w:p>
     <w:p>
@@ -207,18 +342,120 @@
     </w:p>
     <w:p>
       <w:pPr>
+        <w:pStyle w:val="NormalWeb"/>
         <w:jc w:val="both"/>
         <w:rPr>
           <w:rFonts w:asciiTheme="majorHAnsi" w:hAnsiTheme="majorHAnsi" w:cstheme="majorHAnsi"/>
-          <w:lang w:val="pt-BR"/>
+          <w:sz w:val="22"/>
+          <w:szCs w:val="22"/>
         </w:rPr>
       </w:pPr>
       <w:r>
         <w:rPr>
           <w:rFonts w:asciiTheme="majorHAnsi" w:hAnsiTheme="majorHAnsi" w:cstheme="majorHAnsi"/>
-          <w:lang w:val="pt-BR"/>
+          <w:sz w:val="22"/>
+          <w:szCs w:val="22"/>
         </w:rPr>
-        <w:t>(Descreva em poucas linhas o incidente: como ocorreu o vazamento ou a falha de segurança).</w:t>
+        <w:tab/>
+        <w:t>Segundo a reportagem, a empresa</w:t>
+      </w:r>
+      <w:r>
+        <w:rPr>
+          <w:rFonts w:asciiTheme="majorHAnsi" w:hAnsiTheme="majorHAnsi" w:cstheme="majorHAnsi"/>
+          <w:sz w:val="22"/>
+          <w:szCs w:val="22"/>
+        </w:rPr>
+        <w:t xml:space="preserve"> Facebook permitiu que um aplicativo de testes</w:t>
+      </w:r>
+      <w:r>
+        <w:rPr>
+          <w:rFonts w:asciiTheme="majorHAnsi" w:hAnsiTheme="majorHAnsi" w:cstheme="majorHAnsi"/>
+          <w:sz w:val="22"/>
+          <w:szCs w:val="22"/>
+        </w:rPr>
+        <w:t xml:space="preserve"> de personalidade</w:t>
+      </w:r>
+      <w:r>
+        <w:rPr>
+          <w:rFonts w:asciiTheme="majorHAnsi" w:hAnsiTheme="majorHAnsi" w:cstheme="majorHAnsi"/>
+          <w:sz w:val="22"/>
+          <w:szCs w:val="22"/>
+        </w:rPr>
+        <w:t xml:space="preserve"> coletasse dados de usuários e também de seus amigos, sem </w:t>
+      </w:r>
+      <w:r>
+        <w:rPr>
+          <w:rFonts w:asciiTheme="majorHAnsi" w:hAnsiTheme="majorHAnsi" w:cstheme="majorHAnsi"/>
+          <w:sz w:val="22"/>
+          <w:szCs w:val="22"/>
+        </w:rPr>
+        <w:t xml:space="preserve">o </w:t>
+      </w:r>
+      <w:r>
+        <w:rPr>
+          <w:rFonts w:asciiTheme="majorHAnsi" w:hAnsiTheme="majorHAnsi" w:cstheme="majorHAnsi"/>
+          <w:sz w:val="22"/>
+          <w:szCs w:val="22"/>
+        </w:rPr>
+        <w:t xml:space="preserve">consentimento adequado. Essas informações foram repassadas à empresa Cambridge </w:t>
+      </w:r>
+      <w:proofErr w:type="spellStart"/>
+      <w:r>
+        <w:rPr>
+          <w:rFonts w:asciiTheme="majorHAnsi" w:hAnsiTheme="majorHAnsi" w:cstheme="majorHAnsi"/>
+          <w:sz w:val="22"/>
+          <w:szCs w:val="22"/>
+        </w:rPr>
+        <w:t>Analytica</w:t>
+      </w:r>
+      <w:proofErr w:type="spellEnd"/>
+      <w:r>
+        <w:rPr>
+          <w:rFonts w:asciiTheme="majorHAnsi" w:hAnsiTheme="majorHAnsi" w:cstheme="majorHAnsi"/>
+          <w:sz w:val="22"/>
+          <w:szCs w:val="22"/>
+        </w:rPr>
+        <w:t>, que utilizou os dados para influenciar campanhas políticas</w:t>
+      </w:r>
+      <w:r>
+        <w:rPr>
+          <w:rFonts w:asciiTheme="majorHAnsi" w:hAnsiTheme="majorHAnsi" w:cstheme="majorHAnsi"/>
+          <w:sz w:val="22"/>
+          <w:szCs w:val="22"/>
+        </w:rPr>
+        <w:t xml:space="preserve"> no contexto das eleições presidenciais com o partido republicano (Donald Trump). </w:t>
+      </w:r>
+      <w:r>
+        <w:rPr>
+          <w:rFonts w:asciiTheme="majorHAnsi" w:hAnsiTheme="majorHAnsi" w:cstheme="majorHAnsi"/>
+          <w:sz w:val="22"/>
+          <w:szCs w:val="22"/>
+        </w:rPr>
+        <w:t>O problema ocorreu devido a</w:t>
+      </w:r>
+      <w:r>
+        <w:rPr>
+          <w:rFonts w:asciiTheme="majorHAnsi" w:hAnsiTheme="majorHAnsi" w:cstheme="majorHAnsi"/>
+          <w:sz w:val="22"/>
+          <w:szCs w:val="22"/>
+        </w:rPr>
+        <w:t xml:space="preserve"> negligências da empresa e</w:t>
+      </w:r>
+      <w:r>
+        <w:rPr>
+          <w:rFonts w:asciiTheme="majorHAnsi" w:hAnsiTheme="majorHAnsi" w:cstheme="majorHAnsi"/>
+          <w:sz w:val="22"/>
+          <w:szCs w:val="22"/>
+        </w:rPr>
+        <w:t xml:space="preserve"> falhas no controle de acesso e governança de dados da plataforma</w:t>
+      </w:r>
+      <w:r>
+        <w:rPr>
+          <w:rFonts w:asciiTheme="majorHAnsi" w:hAnsiTheme="majorHAnsi" w:cstheme="majorHAnsi"/>
+          <w:sz w:val="22"/>
+          <w:szCs w:val="22"/>
+        </w:rPr>
+        <w:t>.</w:t>
       </w:r>
     </w:p>
     <w:p>
@@ -236,7 +473,15 @@
           <w:color w:val="auto"/>
           <w:lang w:val="pt-BR"/>
         </w:rPr>
-        <w:t>3. Dados pessoais envolvidos</w:t>
+        <w:t>3</w:t>
+      </w:r>
+      <w:r>
+        <w:rPr>
+          <w:rFonts w:cstheme="majorHAnsi"/>
+          <w:color w:val="auto"/>
+          <w:lang w:val="pt-BR"/>
+        </w:rPr>
+        <w:t>. Dados pessoais envolvidos</w:t>
       </w:r>
     </w:p>
     <w:p>
@@ -252,7 +497,25 @@
           <w:rFonts w:asciiTheme="majorHAnsi" w:hAnsiTheme="majorHAnsi" w:cstheme="majorHAnsi"/>
           <w:lang w:val="pt-BR"/>
         </w:rPr>
-        <w:t>(Quais informações foram expostas ou utilizadas indevidamente? Ex.: CPF, endereço, e-mails, dados financeiros etc.)</w:t>
+        <w:tab/>
+        <w:t xml:space="preserve">Entre os dados dos usuários expostos ou utilizados de forma indevida, estão: Nome completo, perfil comportamental como preferências e interesses, geolocalização, redes de amigos e também preferências políticas inferidas. </w:t>
+      </w:r>
+    </w:p>
+    <w:p>
+      <w:pPr>
+        <w:jc w:val="both"/>
+        <w:rPr>
+          <w:rFonts w:asciiTheme="majorHAnsi" w:hAnsiTheme="majorHAnsi" w:cstheme="majorHAnsi"/>
+          <w:lang w:val="pt-BR"/>
+        </w:rPr>
+      </w:pPr>
+      <w:r>
+        <w:rPr>
+          <w:rFonts w:asciiTheme="majorHAnsi" w:hAnsiTheme="majorHAnsi" w:cstheme="majorHAnsi"/>
+          <w:lang w:val="pt-BR"/>
+        </w:rPr>
+        <w:tab/>
+        <w:t>Os dados vazados foram utilizados para análise e entendimento do perfil psicológico dos usuários, sem o devido consentimento claro dos usuários.</w:t>
       </w:r>
     </w:p>
     <w:p>
@@ -284,9 +547,46 @@
       <w:r>
         <w:rPr>
           <w:rFonts w:asciiTheme="majorHAnsi" w:hAnsiTheme="majorHAnsi" w:cstheme="majorHAnsi"/>
+          <w:b/>
+          <w:bCs/>
           <w:lang w:val="pt-BR"/>
         </w:rPr>
-        <w:t>Financeiras: ________________________________________</w:t>
+        <w:t>Financeiras:</w:t>
+      </w:r>
+      <w:r>
+        <w:rPr>
+          <w:rFonts w:asciiTheme="majorHAnsi" w:hAnsiTheme="majorHAnsi" w:cstheme="majorHAnsi"/>
+          <w:lang w:val="pt-BR"/>
+        </w:rPr>
+        <w:t xml:space="preserve"> de acordo </w:t>
+      </w:r>
+      <w:r>
+        <w:rPr>
+          <w:rFonts w:asciiTheme="majorHAnsi" w:hAnsiTheme="majorHAnsi" w:cstheme="majorHAnsi"/>
+          <w:lang w:val="pt-BR"/>
+        </w:rPr>
+        <w:t>com as fontes</w:t>
+      </w:r>
+      <w:r>
+        <w:rPr>
+          <w:rFonts w:asciiTheme="majorHAnsi" w:hAnsiTheme="majorHAnsi" w:cstheme="majorHAnsi"/>
+          <w:lang w:val="pt-BR"/>
+        </w:rPr>
+        <w:t xml:space="preserve"> </w:t>
+      </w:r>
+      <w:r>
+        <w:rPr>
+          <w:rFonts w:asciiTheme="majorHAnsi" w:hAnsiTheme="majorHAnsi" w:cstheme="majorHAnsi"/>
+          <w:lang w:val="pt-BR"/>
+        </w:rPr>
+        <w:t>d</w:t>
+      </w:r>
+      <w:r>
+        <w:rPr>
+          <w:rFonts w:asciiTheme="majorHAnsi" w:hAnsiTheme="majorHAnsi" w:cstheme="majorHAnsi"/>
+          <w:lang w:val="pt-BR"/>
+        </w:rPr>
+        <w:t>a BBC New Brasil por meio Comissão do Comércio Federal de Comércio dos EUA e a Federal Trade Commission (FTC) reporta que a multa pode ter chego a 5 bilhões de dólares.</w:t>
       </w:r>
     </w:p>
     <w:p>
@@ -300,9 +600,25 @@
       <w:r>
         <w:rPr>
           <w:rFonts w:asciiTheme="majorHAnsi" w:hAnsiTheme="majorHAnsi" w:cstheme="majorHAnsi"/>
+          <w:b/>
+          <w:bCs/>
           <w:lang w:val="pt-BR"/>
         </w:rPr>
-        <w:t>Jurídicas (multas, processos): __________________________</w:t>
+        <w:t>Jurídicas (multas, processos):</w:t>
+      </w:r>
+      <w:r>
+        <w:rPr>
+          <w:rFonts w:asciiTheme="majorHAnsi" w:hAnsiTheme="majorHAnsi" w:cstheme="majorHAnsi"/>
+          <w:lang w:val="pt-BR"/>
+        </w:rPr>
+        <w:t xml:space="preserve"> </w:t>
+      </w:r>
+      <w:r>
+        <w:rPr>
+          <w:rFonts w:asciiTheme="majorHAnsi" w:hAnsiTheme="majorHAnsi" w:cstheme="majorHAnsi"/>
+          <w:lang w:val="pt-BR"/>
+        </w:rPr>
+        <w:t xml:space="preserve">processos jurídicos em diversos países, incluindo o Reino Unido e a Europa, investigações regulatórias que incluem impactos da LGPD no Brasil. </w:t>
       </w:r>
     </w:p>
     <w:p>
@@ -316,9 +632,25 @@
       <w:r>
         <w:rPr>
           <w:rFonts w:asciiTheme="majorHAnsi" w:hAnsiTheme="majorHAnsi" w:cstheme="majorHAnsi"/>
+          <w:b/>
+          <w:bCs/>
           <w:lang w:val="pt-BR"/>
         </w:rPr>
-        <w:t>De imagem (impacto na confiança dos clientes): ____________</w:t>
+        <w:t>De imagem (impacto na confiança dos clientes):</w:t>
+      </w:r>
+      <w:r>
+        <w:rPr>
+          <w:rFonts w:asciiTheme="majorHAnsi" w:hAnsiTheme="majorHAnsi" w:cstheme="majorHAnsi"/>
+          <w:lang w:val="pt-BR"/>
+        </w:rPr>
+        <w:t xml:space="preserve"> </w:t>
+      </w:r>
+      <w:r>
+        <w:rPr>
+          <w:rFonts w:asciiTheme="majorHAnsi" w:hAnsiTheme="majorHAnsi" w:cstheme="majorHAnsi"/>
+          <w:lang w:val="pt-BR"/>
+        </w:rPr>
+        <w:t>Perda de confiança global, queda do valor de mercado e um reforço sobre a percepção de falta de controle sobre os dados pessoais que circulam na internet.</w:t>
       </w:r>
     </w:p>
     <w:p>
@@ -336,7 +668,16 @@
           <w:color w:val="auto"/>
           <w:lang w:val="pt-BR"/>
         </w:rPr>
-        <w:t>5. Relação com a Tríade da Segurança (CID)</w:t>
+        <w:lastRenderedPageBreak/>
+        <w:t xml:space="preserve">5. </w:t>
+      </w:r>
+      <w:r>
+        <w:rPr>
+          <w:rFonts w:cstheme="majorHAnsi"/>
+          <w:color w:val="auto"/>
+          <w:lang w:val="pt-BR"/>
+        </w:rPr>
+        <w:t>Relação com a Tríade da Segurança (CID)</w:t>
       </w:r>
     </w:p>
     <w:p>
@@ -349,13 +690,30 @@
       <w:r>
         <w:rPr>
           <w:rFonts w:asciiTheme="majorHAnsi" w:hAnsiTheme="majorHAnsi" w:cstheme="majorHAnsi"/>
+          <w:b/>
+          <w:bCs/>
           <w:lang w:val="pt-BR"/>
         </w:rPr>
-        <w:t>Confidencialidade: ________________________________________</w:t>
+        <w:t>Confidencialidade:</w:t>
+      </w:r>
+      <w:r>
+        <w:rPr>
+          <w:rFonts w:asciiTheme="majorHAnsi" w:hAnsiTheme="majorHAnsi" w:cstheme="majorHAnsi"/>
+          <w:lang w:val="pt-BR"/>
+        </w:rPr>
+        <w:t xml:space="preserve"> </w:t>
+      </w:r>
+      <w:r>
+        <w:rPr>
+          <w:rFonts w:asciiTheme="majorHAnsi" w:hAnsiTheme="majorHAnsi" w:cstheme="majorHAnsi"/>
+          <w:lang w:val="pt-BR"/>
+        </w:rPr>
+        <w:t>Violada uma vez que dados pessoais dos usuários foram compartilhados com terceiros sem a autorização clara e expressa.</w:t>
       </w:r>
     </w:p>
     <w:p>
       <w:pPr>
+        <w:jc w:val="both"/>
         <w:rPr>
           <w:rFonts w:asciiTheme="majorHAnsi" w:hAnsiTheme="majorHAnsi" w:cstheme="majorHAnsi"/>
           <w:lang w:val="pt-BR"/>
@@ -364,13 +722,30 @@
       <w:r>
         <w:rPr>
           <w:rFonts w:asciiTheme="majorHAnsi" w:hAnsiTheme="majorHAnsi" w:cstheme="majorHAnsi"/>
+          <w:b/>
+          <w:bCs/>
           <w:lang w:val="pt-BR"/>
         </w:rPr>
-        <w:t>Integridade: ________________________________________</w:t>
+        <w:t>Integridade:</w:t>
+      </w:r>
+      <w:r>
+        <w:rPr>
+          <w:rFonts w:asciiTheme="majorHAnsi" w:hAnsiTheme="majorHAnsi" w:cstheme="majorHAnsi"/>
+          <w:lang w:val="pt-BR"/>
+        </w:rPr>
+        <w:t xml:space="preserve"> </w:t>
+      </w:r>
+      <w:r>
+        <w:rPr>
+          <w:rFonts w:asciiTheme="majorHAnsi" w:hAnsiTheme="majorHAnsi" w:cstheme="majorHAnsi"/>
+          <w:lang w:val="pt-BR"/>
+        </w:rPr>
+        <w:t>comprometida em virtude da utilização dos dados fora do escopo (propósito original) da plataforma o que pode ser caracterizada como uma distorção da finalidade legítima.</w:t>
       </w:r>
     </w:p>
     <w:p>
       <w:pPr>
+        <w:jc w:val="both"/>
         <w:rPr>
           <w:rFonts w:asciiTheme="majorHAnsi" w:hAnsiTheme="majorHAnsi" w:cstheme="majorHAnsi"/>
           <w:lang w:val="pt-BR"/>
@@ -379,9 +754,25 @@
       <w:r>
         <w:rPr>
           <w:rFonts w:asciiTheme="majorHAnsi" w:hAnsiTheme="majorHAnsi" w:cstheme="majorHAnsi"/>
+          <w:b/>
+          <w:bCs/>
           <w:lang w:val="pt-BR"/>
         </w:rPr>
-        <w:t>Disponibilidade: ________________________________________</w:t>
+        <w:t>Disponibilidade:</w:t>
+      </w:r>
+      <w:r>
+        <w:rPr>
+          <w:rFonts w:asciiTheme="majorHAnsi" w:hAnsiTheme="majorHAnsi" w:cstheme="majorHAnsi"/>
+          <w:lang w:val="pt-BR"/>
+        </w:rPr>
+        <w:t xml:space="preserve"> </w:t>
+      </w:r>
+      <w:r>
+        <w:rPr>
+          <w:rFonts w:asciiTheme="majorHAnsi" w:hAnsiTheme="majorHAnsi" w:cstheme="majorHAnsi"/>
+          <w:lang w:val="pt-BR"/>
+        </w:rPr>
+        <w:t>não foi o foco do problema, pois os sistemas continuaram funcionando normalmente, mas ao cesso indevido comprometeu o controle das informações</w:t>
       </w:r>
     </w:p>
     <w:p>
@@ -399,8 +790,23 @@
           <w:color w:val="auto"/>
           <w:lang w:val="pt-BR"/>
         </w:rPr>
-        <w:t>6. Como a Política de Segurança poderia ter evitado o problema?</w:t>
+        <w:t xml:space="preserve">6. Como a Política de Segurança poderia ter </w:t>
       </w:r>
+      <w:r>
+        <w:rPr>
+          <w:rFonts w:cstheme="majorHAnsi"/>
+          <w:color w:val="auto"/>
+          <w:lang w:val="pt-BR"/>
+        </w:rPr>
+        <w:t>evitado o problema?</w:t>
+      </w:r>
+    </w:p>
+    <w:p>
+      <w:pPr>
+        <w:rPr>
+          <w:lang w:val="pt-BR"/>
+        </w:rPr>
+      </w:pPr>
     </w:p>
     <w:p>
       <w:pPr>
@@ -415,7 +821,33 @@
           <w:rFonts w:asciiTheme="majorHAnsi" w:hAnsiTheme="majorHAnsi" w:cstheme="majorHAnsi"/>
           <w:lang w:val="pt-BR"/>
         </w:rPr>
-        <w:t>(Explique quais práticas ou regras poderiam ter prevenido ou reduzido o impacto do incidente. Ex.: criptografia, backup, controle de acesso, auditorias, treinamento de funcionários, adequação à LGPD).</w:t>
+        <w:tab/>
+        <w:t>Diversas práticas diferentes envolvendo uma política de segurança bem estruturada poderiam ter sido utilizadas para prevenir ou minimizar o incidente, como por exemplo: controle de acesso mais rigoroso com limitações sobre as informações que aplicativos externos podem ou não coletar. Consentimento explicito (LGPD): usuários informados de forma clara e expressa sobre a utilização de seus dados.</w:t>
+      </w:r>
+      <w:r>
+        <w:rPr>
+          <w:rFonts w:asciiTheme="majorHAnsi" w:hAnsiTheme="majorHAnsi" w:cstheme="majorHAnsi"/>
+          <w:lang w:val="pt-BR"/>
+        </w:rPr>
+        <w:t xml:space="preserve"> Auditorias e monitoramentos: celeridade na identificação do uso indevido de dados. Criptografia: processo mais rigoroso para codificação e decodificação da dados que circulam na internet. </w:t>
+      </w:r>
+      <w:proofErr w:type="spellStart"/>
+      <w:r>
+        <w:rPr>
+          <w:rFonts w:asciiTheme="majorHAnsi" w:hAnsiTheme="majorHAnsi" w:cstheme="majorHAnsi"/>
+          <w:i/>
+          <w:iCs/>
+          <w:lang w:val="pt-BR"/>
+        </w:rPr>
+        <w:t>Compliance</w:t>
+      </w:r>
+      <w:proofErr w:type="spellEnd"/>
+      <w:r>
+        <w:rPr>
+          <w:rFonts w:asciiTheme="majorHAnsi" w:hAnsiTheme="majorHAnsi" w:cstheme="majorHAnsi"/>
+          <w:lang w:val="pt-BR"/>
+        </w:rPr>
+        <w:t xml:space="preserve"> com LGPD: adequação às leis e normas de tratamento de dados.</w:t>
       </w:r>
     </w:p>
     <w:p>
@@ -449,8 +881,249 @@
           <w:rFonts w:asciiTheme="majorHAnsi" w:hAnsiTheme="majorHAnsi" w:cstheme="majorHAnsi"/>
           <w:lang w:val="pt-BR"/>
         </w:rPr>
-        <w:t>(O que você aprendeu com esse caso? Como esse exemplo reforça a importância da LGPD e do compliance em segurança da informação?)</w:t>
+        <w:tab/>
+        <w:t>O exemplo do Facebook demonstra que dados são considerados como ativos (recursos) extremamente sensíveis e importantes na sociedade contemporânea. Assim, falhas relacionadas a sua proteção podem gerar impactos financeiros, jurídicos e reputacionais severos para uma organização sem contar os impactos na vida pessoal dos usuários que tiveram informações vazadas.</w:t>
       </w:r>
+    </w:p>
+    <w:p>
+      <w:pPr>
+        <w:jc w:val="both"/>
+        <w:rPr>
+          <w:rFonts w:asciiTheme="majorHAnsi" w:hAnsiTheme="majorHAnsi" w:cstheme="majorHAnsi"/>
+          <w:lang w:val="pt-BR"/>
+        </w:rPr>
+      </w:pPr>
+      <w:r>
+        <w:rPr>
+          <w:rFonts w:asciiTheme="majorHAnsi" w:hAnsiTheme="majorHAnsi" w:cstheme="majorHAnsi"/>
+          <w:lang w:val="pt-BR"/>
+        </w:rPr>
+        <w:tab/>
+        <w:t>Desse modo, segurança da informação não é apenas uma habilidade técnica a ser desenvolvida, mas uma estratégia organizacional de segurança e reputação. Empresas que ignoram esse assunto correm riscos de prejuízo e perda de confiança</w:t>
+      </w:r>
+    </w:p>
+    <w:p>
+      <w:pPr>
+        <w:jc w:val="both"/>
+        <w:rPr>
+          <w:rFonts w:asciiTheme="majorHAnsi" w:hAnsiTheme="majorHAnsi" w:cstheme="majorHAnsi"/>
+          <w:lang w:val="pt-BR"/>
+        </w:rPr>
+      </w:pPr>
+    </w:p>
+    <w:p>
+      <w:pPr>
+        <w:jc w:val="both"/>
+        <w:rPr>
+          <w:rFonts w:asciiTheme="majorHAnsi" w:hAnsiTheme="majorHAnsi" w:cstheme="majorHAnsi"/>
+          <w:b/>
+          <w:bCs/>
+          <w:lang w:val="pt-BR"/>
+        </w:rPr>
+      </w:pPr>
+      <w:r>
+        <w:rPr>
+          <w:rFonts w:asciiTheme="majorHAnsi" w:hAnsiTheme="majorHAnsi" w:cstheme="majorHAnsi"/>
+          <w:b/>
+          <w:bCs/>
+          <w:lang w:val="pt-BR"/>
+        </w:rPr>
+        <w:t>Referências</w:t>
+      </w:r>
+    </w:p>
+    <w:p>
+      <w:pPr>
+        <w:spacing w:before="100" w:beforeAutospacing="1" w:after="100" w:afterAutospacing="1" w:line="240" w:lineRule="auto"/>
+        <w:rPr>
+          <w:rFonts w:asciiTheme="majorHAnsi" w:eastAsia="Times New Roman" w:hAnsiTheme="majorHAnsi" w:cstheme="majorHAnsi"/>
+          <w:sz w:val="20"/>
+          <w:szCs w:val="20"/>
+          <w:lang w:val="pt-BR" w:eastAsia="pt-BR"/>
+        </w:rPr>
+      </w:pPr>
+      <w:r>
+        <w:rPr>
+          <w:rFonts w:asciiTheme="majorHAnsi" w:eastAsia="Times New Roman" w:hAnsiTheme="majorHAnsi" w:cstheme="majorHAnsi"/>
+          <w:sz w:val="20"/>
+          <w:szCs w:val="20"/>
+          <w:lang w:val="pt-BR" w:eastAsia="pt-BR"/>
+        </w:rPr>
+        <w:t xml:space="preserve">CANAL DO VÍDEO. Título do vídeo. YouTube, ano de publicação. Disponível em: </w:t>
+      </w:r>
+      <w:hyperlink r:id="rId6" w:tgtFrame="_new" w:history="1">
+        <w:r>
+          <w:rPr>
+            <w:rFonts w:asciiTheme="majorHAnsi" w:eastAsia="Times New Roman" w:hAnsiTheme="majorHAnsi" w:cstheme="majorHAnsi"/>
+            <w:color w:val="0000FF"/>
+            <w:sz w:val="20"/>
+            <w:szCs w:val="20"/>
+            <w:u w:val="single"/>
+            <w:lang w:val="pt-BR" w:eastAsia="pt-BR"/>
+          </w:rPr>
+          <w:t>https://www.youtube.com/watch?v=Ftf4rn-q</w:t>
+        </w:r>
+        <w:r>
+          <w:rPr>
+            <w:rFonts w:asciiTheme="majorHAnsi" w:eastAsia="Times New Roman" w:hAnsiTheme="majorHAnsi" w:cstheme="majorHAnsi"/>
+            <w:color w:val="0000FF"/>
+            <w:sz w:val="20"/>
+            <w:szCs w:val="20"/>
+            <w:u w:val="single"/>
+            <w:lang w:val="pt-BR" w:eastAsia="pt-BR"/>
+          </w:rPr>
+          <w:t>q</w:t>
+        </w:r>
+        <w:r>
+          <w:rPr>
+            <w:rFonts w:asciiTheme="majorHAnsi" w:eastAsia="Times New Roman" w:hAnsiTheme="majorHAnsi" w:cstheme="majorHAnsi"/>
+            <w:color w:val="0000FF"/>
+            <w:sz w:val="20"/>
+            <w:szCs w:val="20"/>
+            <w:u w:val="single"/>
+            <w:lang w:val="pt-BR" w:eastAsia="pt-BR"/>
+          </w:rPr>
+          <w:t>7w</w:t>
+        </w:r>
+      </w:hyperlink>
+      <w:r>
+        <w:rPr>
+          <w:rFonts w:asciiTheme="majorHAnsi" w:eastAsia="Times New Roman" w:hAnsiTheme="majorHAnsi" w:cstheme="majorHAnsi"/>
+          <w:sz w:val="20"/>
+          <w:szCs w:val="20"/>
+          <w:lang w:val="pt-BR" w:eastAsia="pt-BR"/>
+        </w:rPr>
+        <w:t>. Acesso em: 21 mar. 2026.</w:t>
+      </w:r>
+    </w:p>
+    <w:p>
+      <w:pPr>
+        <w:spacing w:before="100" w:beforeAutospacing="1" w:after="100" w:afterAutospacing="1" w:line="240" w:lineRule="auto"/>
+        <w:rPr>
+          <w:rFonts w:asciiTheme="majorHAnsi" w:eastAsia="Times New Roman" w:hAnsiTheme="majorHAnsi" w:cstheme="majorHAnsi"/>
+          <w:sz w:val="20"/>
+          <w:szCs w:val="20"/>
+          <w:lang w:val="pt-BR" w:eastAsia="pt-BR"/>
+        </w:rPr>
+      </w:pPr>
+      <w:r>
+        <w:rPr>
+          <w:rFonts w:asciiTheme="majorHAnsi" w:eastAsia="Times New Roman" w:hAnsiTheme="majorHAnsi" w:cstheme="majorHAnsi"/>
+          <w:sz w:val="20"/>
+          <w:szCs w:val="20"/>
+          <w:lang w:val="pt-BR" w:eastAsia="pt-BR"/>
+        </w:rPr>
+        <w:t xml:space="preserve">CANAL DO VÍDEO. Título do vídeo. YouTube, ano de publicação. Disponível em: </w:t>
+      </w:r>
+      <w:hyperlink r:id="rId7" w:tgtFrame="_new" w:history="1">
+        <w:r>
+          <w:rPr>
+            <w:rFonts w:asciiTheme="majorHAnsi" w:eastAsia="Times New Roman" w:hAnsiTheme="majorHAnsi" w:cstheme="majorHAnsi"/>
+            <w:color w:val="0000FF"/>
+            <w:sz w:val="20"/>
+            <w:szCs w:val="20"/>
+            <w:u w:val="single"/>
+            <w:lang w:val="pt-BR" w:eastAsia="pt-BR"/>
+          </w:rPr>
+          <w:t>https://www.youtube.com/watch?v=x1SnHHby</w:t>
+        </w:r>
+        <w:r>
+          <w:rPr>
+            <w:rFonts w:asciiTheme="majorHAnsi" w:eastAsia="Times New Roman" w:hAnsiTheme="majorHAnsi" w:cstheme="majorHAnsi"/>
+            <w:color w:val="0000FF"/>
+            <w:sz w:val="20"/>
+            <w:szCs w:val="20"/>
+            <w:u w:val="single"/>
+            <w:lang w:val="pt-BR" w:eastAsia="pt-BR"/>
+          </w:rPr>
+          <w:t>0</w:t>
+        </w:r>
+        <w:r>
+          <w:rPr>
+            <w:rFonts w:asciiTheme="majorHAnsi" w:eastAsia="Times New Roman" w:hAnsiTheme="majorHAnsi" w:cstheme="majorHAnsi"/>
+            <w:color w:val="0000FF"/>
+            <w:sz w:val="20"/>
+            <w:szCs w:val="20"/>
+            <w:u w:val="single"/>
+            <w:lang w:val="pt-BR" w:eastAsia="pt-BR"/>
+          </w:rPr>
+          <w:t>wA</w:t>
+        </w:r>
+      </w:hyperlink>
+      <w:r>
+        <w:rPr>
+          <w:rFonts w:asciiTheme="majorHAnsi" w:eastAsia="Times New Roman" w:hAnsiTheme="majorHAnsi" w:cstheme="majorHAnsi"/>
+          <w:sz w:val="20"/>
+          <w:szCs w:val="20"/>
+          <w:lang w:val="pt-BR" w:eastAsia="pt-BR"/>
+        </w:rPr>
+        <w:t>. Acesso em: 21 mar. 2026.</w:t>
+      </w:r>
+    </w:p>
+    <w:p>
+      <w:pPr>
+        <w:spacing w:before="100" w:beforeAutospacing="1" w:after="100" w:afterAutospacing="1" w:line="240" w:lineRule="auto"/>
+        <w:rPr>
+          <w:rFonts w:asciiTheme="majorHAnsi" w:eastAsia="Times New Roman" w:hAnsiTheme="majorHAnsi" w:cstheme="majorHAnsi"/>
+          <w:sz w:val="20"/>
+          <w:szCs w:val="20"/>
+          <w:lang w:val="pt-BR" w:eastAsia="pt-BR"/>
+        </w:rPr>
+      </w:pPr>
+    </w:p>
+    <w:p>
+      <w:pPr>
+        <w:spacing w:before="100" w:beforeAutospacing="1" w:after="100" w:afterAutospacing="1" w:line="240" w:lineRule="auto"/>
+        <w:rPr>
+          <w:rFonts w:asciiTheme="majorHAnsi" w:eastAsia="Times New Roman" w:hAnsiTheme="majorHAnsi" w:cstheme="majorHAnsi"/>
+          <w:sz w:val="20"/>
+          <w:szCs w:val="20"/>
+          <w:lang w:val="pt-BR" w:eastAsia="pt-BR"/>
+        </w:rPr>
+      </w:pPr>
+      <w:r>
+        <w:rPr>
+          <w:rFonts w:asciiTheme="majorHAnsi" w:eastAsia="Times New Roman" w:hAnsiTheme="majorHAnsi" w:cstheme="majorHAnsi"/>
+          <w:sz w:val="20"/>
+          <w:szCs w:val="20"/>
+          <w:lang w:val="pt-BR" w:eastAsia="pt-BR"/>
+        </w:rPr>
+        <w:lastRenderedPageBreak/>
+        <w:t xml:space="preserve">G1. Entenda o escândalo de uso político de dados que derrubou valor do Facebook e o colocou na mira de autoridades. Disponível em: </w:t>
+      </w:r>
+      <w:hyperlink r:id="rId8" w:tgtFrame="_new" w:history="1">
+        <w:r>
+          <w:rPr>
+            <w:rFonts w:asciiTheme="majorHAnsi" w:eastAsia="Times New Roman" w:hAnsiTheme="majorHAnsi" w:cstheme="majorHAnsi"/>
+            <w:color w:val="0000FF"/>
+            <w:sz w:val="20"/>
+            <w:szCs w:val="20"/>
+            <w:u w:val="single"/>
+            <w:lang w:val="pt-BR" w:eastAsia="pt-BR"/>
+          </w:rPr>
+          <w:t>https://g1.globo.com/economia/tecnologia/noticia/entenda-o-escandalo-de-uso-politico-de-dados-que-derrubou-valor-do-facebook-e-o-colocou-na-mira-de-autoridades.ghtml</w:t>
+        </w:r>
+      </w:hyperlink>
+      <w:r>
+        <w:rPr>
+          <w:rFonts w:asciiTheme="majorHAnsi" w:eastAsia="Times New Roman" w:hAnsiTheme="majorHAnsi" w:cstheme="majorHAnsi"/>
+          <w:sz w:val="20"/>
+          <w:szCs w:val="20"/>
+          <w:lang w:val="pt-BR" w:eastAsia="pt-BR"/>
+        </w:rPr>
+        <w:t>. Acesso em: 21 mar. 2026.</w:t>
+      </w:r>
+    </w:p>
+    <w:p>
+      <w:pPr>
+        <w:spacing w:line="240" w:lineRule="auto"/>
+        <w:jc w:val="both"/>
+        <w:rPr>
+          <w:rFonts w:asciiTheme="majorHAnsi" w:hAnsiTheme="majorHAnsi" w:cstheme="majorHAnsi"/>
+          <w:b/>
+          <w:bCs/>
+          <w:lang w:val="pt-BR"/>
+        </w:rPr>
+      </w:pPr>
     </w:p>
     <w:sectPr>
       <w:pgSz w:w="12240" w:h="15840"/>
@@ -463,7 +1136,7 @@
 </file>
 
 <file path=word/numbering.xml><?xml version="1.0" encoding="utf-8"?>
-<w:numbering xmlns:wpc="http://schemas.microsoft.com/office/word/2010/wordprocessingCanvas" xmlns:cx="http://schemas.microsoft.com/office/drawing/2014/chartex" xmlns:cx1="http://schemas.microsoft.com/office/drawing/2015/9/8/chartex" xmlns:cx2="http://schemas.microsoft.com/office/drawing/2015/10/21/chartex" xmlns:cx3="http://schemas.microsoft.com/office/drawing/2016/5/9/chartex" xmlns:cx4="http://schemas.microsoft.com/office/drawing/2016/5/10/chartex" xmlns:cx5="http://schemas.microsoft.com/office/drawing/2016/5/11/chartex" xmlns:cx6="http://schemas.microsoft.com/office/drawing/2016/5/12/chartex" xmlns:cx7="http://schemas.microsoft.com/office/drawing/2016/5/13/chartex" xmlns:cx8="http://schemas.microsoft.com/office/drawing/2016/5/14/chartex" xmlns:mc="http://schemas.openxmlformats.org/markup-compatibility/2006" xmlns:aink="http://schemas.microsoft.com/office/drawing/2016/ink" xmlns:am3d="http://schemas.microsoft.com/office/drawing/2017/model3d" xmlns:o="urn:schemas-microsoft-com:office:office" xmlns:oel="http://schemas.microsoft.com/office/2019/extlst" xmlns:r="http://schemas.openxmlformats.org/officeDocument/2006/relationships" xmlns:m="http://schemas.openxmlformats.org/officeDocument/2006/math" xmlns:v="urn:schemas-microsoft-com:vml" xmlns:wp14="http://schemas.microsoft.com/office/word/2010/wordprocessingDrawing" xmlns:wp="http://schemas.openxmlformats.org/drawingml/2006/wordprocessingDrawing" xmlns:w10="urn:schemas-microsoft-com:office:word" xmlns:w="http://schemas.openxmlformats.org/wordprocessingml/2006/main" xmlns:w14="http://schemas.microsoft.com/office/word/2010/wordml" xmlns:w15="http://schemas.microsoft.com/office/word/2012/wordml" xmlns:w16cex="http://schemas.microsoft.com/office/word/2018/wordml/cex" xmlns:w16cid="http://schemas.microsoft.com/office/word/2016/wordml/cid" xmlns:w16="http://schemas.microsoft.com/office/word/2018/wordml" xmlns:w16du="http://schemas.microsoft.com/office/word/2023/wordml/word16du" xmlns:w16sdtdh="http://schemas.microsoft.com/office/word/2020/wordml/sdtdatahash" xmlns:w16sdtfl="http://schemas.microsoft.com/office/word/2024/wordml/sdtformatlock" xmlns:w16se="http://schemas.microsoft.com/office/word/2015/wordml/symex" xmlns:wpg="http://schemas.microsoft.com/office/word/2010/wordprocessingGroup" xmlns:wpi="http://schemas.microsoft.com/office/word/2010/wordprocessingInk" xmlns:wne="http://schemas.microsoft.com/office/word/2006/wordml" xmlns:wps="http://schemas.microsoft.com/office/word/2010/wordprocessingShape" mc:Ignorable="w14 w15 w16se w16cid w16 w16cex w16sdtdh w16sdtfl w16du wp14">
+<w:numbering xmlns:wpc="http://schemas.microsoft.com/office/word/2010/wordprocessingCanvas" xmlns:cx="http://schemas.microsoft.com/office/drawing/2014/chartex" xmlns:cx1="http://schemas.microsoft.com/office/drawing/2015/9/8/chartex" xmlns:cx2="http://schemas.microsoft.com/office/drawing/2015/10/21/chartex" xmlns:cx3="http://schemas.microsoft.com/office/drawing/2016/5/9/chartex" xmlns:cx4="http://schemas.microsoft.com/office/drawing/2016/5/10/chartex" xmlns:cx5="http://schemas.microsoft.com/office/drawing/2016/5/11/chartex" xmlns:cx6="http://schemas.microsoft.com/office/drawing/2016/5/12/chartex" xmlns:cx7="http://schemas.microsoft.com/office/drawing/2016/5/13/chartex" xmlns:cx8="http://schemas.microsoft.com/office/drawing/2016/5/14/chartex" xmlns:mc="http://schemas.openxmlformats.org/markup-compatibility/2006" xmlns:aink="http://schemas.microsoft.com/office/drawing/2016/ink" xmlns:am3d="http://schemas.microsoft.com/office/drawing/2017/model3d" xmlns:o="urn:schemas-microsoft-com:office:office" xmlns:r="http://schemas.openxmlformats.org/officeDocument/2006/relationships" xmlns:m="http://schemas.openxmlformats.org/officeDocument/2006/math" xmlns:v="urn:schemas-microsoft-com:vml" xmlns:wp14="http://schemas.microsoft.com/office/word/2010/wordprocessingDrawing" xmlns:wp="http://schemas.openxmlformats.org/drawingml/2006/wordprocessingDrawing" xmlns:w10="urn:schemas-microsoft-com:office:word" xmlns:w="http://schemas.openxmlformats.org/wordprocessingml/2006/main" xmlns:w14="http://schemas.microsoft.com/office/word/2010/wordml" xmlns:w15="http://schemas.microsoft.com/office/word/2012/wordml" xmlns:w16cex="http://schemas.microsoft.com/office/word/2018/wordml/cex" xmlns:w16cid="http://schemas.microsoft.com/office/word/2016/wordml/cid" xmlns:w16="http://schemas.microsoft.com/office/word/2018/wordml" xmlns:w16sdtdh="http://schemas.microsoft.com/office/word/2020/wordml/sdtdatahash" xmlns:w16se="http://schemas.microsoft.com/office/word/2015/wordml/symex" xmlns:wpg="http://schemas.microsoft.com/office/word/2010/wordprocessingGroup" xmlns:wpi="http://schemas.microsoft.com/office/word/2010/wordprocessingInk" xmlns:wne="http://schemas.microsoft.com/office/word/2006/wordml" xmlns:wps="http://schemas.microsoft.com/office/word/2010/wordprocessingShape" mc:Ignorable="w14 w15 w16se w16cid w16 w16cex w16sdtdh wp14">
   <w:abstractNum w:abstractNumId="0" w15:restartNumberingAfterBreak="0">
     <w:nsid w:val="FFFFFF7C"/>
     <w:multiLevelType w:val="singleLevel"/>
@@ -635,38 +1308,38 @@
       </w:rPr>
     </w:lvl>
   </w:abstractNum>
-  <w:num w:numId="1" w16cid:durableId="1826968848">
+  <w:num w:numId="1">
     <w:abstractNumId w:val="8"/>
   </w:num>
-  <w:num w:numId="2" w16cid:durableId="15235860">
+  <w:num w:numId="2">
     <w:abstractNumId w:val="6"/>
   </w:num>
-  <w:num w:numId="3" w16cid:durableId="136193334">
+  <w:num w:numId="3">
     <w:abstractNumId w:val="5"/>
   </w:num>
-  <w:num w:numId="4" w16cid:durableId="585185973">
+  <w:num w:numId="4">
     <w:abstractNumId w:val="4"/>
   </w:num>
-  <w:num w:numId="5" w16cid:durableId="1793356363">
+  <w:num w:numId="5">
     <w:abstractNumId w:val="7"/>
   </w:num>
-  <w:num w:numId="6" w16cid:durableId="1214660748">
+  <w:num w:numId="6">
     <w:abstractNumId w:val="3"/>
   </w:num>
-  <w:num w:numId="7" w16cid:durableId="1533037289">
+  <w:num w:numId="7">
     <w:abstractNumId w:val="2"/>
   </w:num>
-  <w:num w:numId="8" w16cid:durableId="1423603946">
+  <w:num w:numId="8">
     <w:abstractNumId w:val="1"/>
   </w:num>
-  <w:num w:numId="9" w16cid:durableId="644772111">
+  <w:num w:numId="9">
     <w:abstractNumId w:val="0"/>
   </w:num>
 </w:numbering>
 </file>
 
 <file path=word/styles.xml><?xml version="1.0" encoding="utf-8"?>
-<w:styles xmlns:mc="http://schemas.openxmlformats.org/markup-compatibility/2006" xmlns:r="http://schemas.openxmlformats.org/officeDocument/2006/relationships" xmlns:w="http://schemas.openxmlformats.org/wordprocessingml/2006/main" xmlns:w14="http://schemas.microsoft.com/office/word/2010/wordml" xmlns:w15="http://schemas.microsoft.com/office/word/2012/wordml" xmlns:w16cex="http://schemas.microsoft.com/office/word/2018/wordml/cex" xmlns:w16cid="http://schemas.microsoft.com/office/word/2016/wordml/cid" xmlns:w16="http://schemas.microsoft.com/office/word/2018/wordml" xmlns:w16du="http://schemas.microsoft.com/office/word/2023/wordml/word16du" xmlns:w16sdtdh="http://schemas.microsoft.com/office/word/2020/wordml/sdtdatahash" xmlns:w16sdtfl="http://schemas.microsoft.com/office/word/2024/wordml/sdtformatlock" xmlns:w16se="http://schemas.microsoft.com/office/word/2015/wordml/symex" mc:Ignorable="w14 w15 w16se w16cid w16 w16cex w16sdtdh w16sdtfl w16du">
+<w:styles xmlns:mc="http://schemas.openxmlformats.org/markup-compatibility/2006" xmlns:r="http://schemas.openxmlformats.org/officeDocument/2006/relationships" xmlns:w="http://schemas.openxmlformats.org/wordprocessingml/2006/main" xmlns:w14="http://schemas.microsoft.com/office/word/2010/wordml" xmlns:w15="http://schemas.microsoft.com/office/word/2012/wordml" xmlns:w16cex="http://schemas.microsoft.com/office/word/2018/wordml/cex" xmlns:w16cid="http://schemas.microsoft.com/office/word/2016/wordml/cid" xmlns:w16="http://schemas.microsoft.com/office/word/2018/wordml" xmlns:w16sdtdh="http://schemas.microsoft.com/office/word/2020/wordml/sdtdatahash" xmlns:w16se="http://schemas.microsoft.com/office/word/2015/wordml/symex" mc:Ignorable="w14 w15 w16se w16cid w16 w16cex w16sdtdh">
   <w:docDefaults>
     <w:rPrDefault>
       <w:rPr>
@@ -12045,6 +12718,34 @@
       </w:tcPr>
     </w:tblStylePr>
   </w:style>
+  <w:style w:type="paragraph" w:styleId="NormalWeb">
+    <w:name w:val="Normal (Web)"/>
+    <w:basedOn w:val="Normal"/>
+    <w:uiPriority w:val="99"/>
+    <w:unhideWhenUsed/>
+    <w:rsid w:val="00F83A4E"/>
+    <w:pPr>
+      <w:spacing w:before="100" w:beforeAutospacing="1" w:after="100" w:afterAutospacing="1" w:line="240" w:lineRule="auto"/>
+    </w:pPr>
+    <w:rPr>
+      <w:rFonts w:ascii="Times New Roman" w:eastAsia="Times New Roman" w:hAnsi="Times New Roman" w:cs="Times New Roman"/>
+      <w:sz w:val="24"/>
+      <w:szCs w:val="24"/>
+      <w:lang w:val="pt-BR" w:eastAsia="pt-BR"/>
+    </w:rPr>
+  </w:style>
+  <w:style w:type="character" w:styleId="Hyperlink">
+    <w:name w:val="Hyperlink"/>
+    <w:basedOn w:val="Fontepargpadro"/>
+    <w:uiPriority w:val="99"/>
+    <w:semiHidden/>
+    <w:unhideWhenUsed/>
+    <w:rsid w:val="00705011"/>
+    <w:rPr>
+      <w:color w:val="0000FF"/>
+      <w:u w:val="single"/>
+    </w:rPr>
+  </w:style>
 </w:styles>
 </file>
 

</xml_diff>